<commit_message>
Escape the angle brackets that made three lockup files invalid XML
The <desc> I wrote into the flat lockup variants said "for <img> on light
grounds" with the tag unescaped, which closed the desc element early and
made the file unparseable. Chrome rendered a broken-image icon and the
letterhead shipped with an empty logo box.

Caught by parsing every brand SVG rather than by looking at the file
sizes, which looked plausible throughout.

The kit is rebuilt on the repaired asset, so the documents now carry the
vectorised lockup in a single colour and the header rule is crimson.

Co-Authored-By: Claude Opus 5 (1M context) <noreply@anthropic.com>
</commit_message>
<xml_diff>
--- a/docs/brand/kit/01-letterhead.docx
+++ b/docs/brand/kit/01-letterhead.docx
@@ -17,7 +17,7 @@
       <w:r>
         <w:drawing>
           <wp:inline>
-            <wp:extent cx="5334000" cy="2592916"/>
+            <wp:extent cx="5334000" cy="3074458"/>
             <wp:effectExtent b="0" l="0" r="0" t="0"/>
             <wp:docPr descr="Axelis Overseas" title="" id="10" name="Picture"/>
             <a:graphic>
@@ -38,7 +38,7 @@
                   <pic:spPr bwMode="auto">
                     <a:xfrm>
                       <a:off x="0" y="0"/>
-                      <a:ext cx="5334000" cy="2592916"/>
+                      <a:ext cx="5334000" cy="3074458"/>
                     </a:xfrm>
                     <a:prstGeom prst="rect">
                       <a:avLst/>

</xml_diff>